<commit_message>
AI for Engineers: chapters 8-9, report layout with per-night limits, analyzer edge case
Co-Authored-By: Claude Opus 5.5 <noreply@anthropic.com>
Claude-Session: https://claude.ai/code/session_01LMp7qy4noFDmXK6dQtwLBW
</commit_message>
<xml_diff>
--- a/ai-for-engineers/projects/p05-test-report/output/report-2026-10-06-sonnet-run1.docx
+++ b/ai-for-engineers/projects/p05-test-report/output/report-2026-10-06-sonnet-run1.docx
@@ -49,19 +49,20 @@
       <w:tblPr>
         <w:tblStyle w:val="LightGrid-Accent1"/>
         <w:tblW w:type="auto" w:w="0"/>
+        <w:tblLayout w:type="fixed"/>
         <w:tblLook w:firstColumn="1" w:firstRow="1" w:lastColumn="0" w:lastRow="0" w:noHBand="0" w:noVBand="1" w:val="04A0"/>
       </w:tblPr>
       <w:tblGrid>
-        <w:gridCol w:w="1728"/>
-        <w:gridCol w:w="1728"/>
-        <w:gridCol w:w="1728"/>
-        <w:gridCol w:w="1728"/>
-        <w:gridCol w:w="1728"/>
+        <w:gridCol w:w="737"/>
+        <w:gridCol w:w="1304"/>
+        <w:gridCol w:w="2721"/>
+        <w:gridCol w:w="1020"/>
+        <w:gridCol w:w="3288"/>
       </w:tblGrid>
       <w:tr>
         <w:tc>
           <w:tcPr>
-            <w:tcW w:type="dxa" w:w="1728"/>
+            <w:tcW w:type="dxa" w:w="737"/>
           </w:tcPr>
           <w:p>
             <w:r>
@@ -71,7 +72,7 @@
         </w:tc>
         <w:tc>
           <w:tcPr>
-            <w:tcW w:type="dxa" w:w="1728"/>
+            <w:tcW w:type="dxa" w:w="1304"/>
           </w:tcPr>
           <w:p>
             <w:r>
@@ -81,7 +82,7 @@
         </w:tc>
         <w:tc>
           <w:tcPr>
-            <w:tcW w:type="dxa" w:w="1728"/>
+            <w:tcW w:type="dxa" w:w="2721"/>
           </w:tcPr>
           <w:p>
             <w:r>
@@ -91,7 +92,7 @@
         </w:tc>
         <w:tc>
           <w:tcPr>
-            <w:tcW w:type="dxa" w:w="1728"/>
+            <w:tcW w:type="dxa" w:w="1020"/>
           </w:tcPr>
           <w:p>
             <w:r>
@@ -101,7 +102,7 @@
         </w:tc>
         <w:tc>
           <w:tcPr>
-            <w:tcW w:type="dxa" w:w="1728"/>
+            <w:tcW w:type="dxa" w:w="3288"/>
           </w:tcPr>
           <w:p>
             <w:r>
@@ -113,7 +114,7 @@
       <w:tr>
         <w:tc>
           <w:tcPr>
-            <w:tcW w:type="dxa" w:w="1728"/>
+            <w:tcW w:type="dxa" w:w="737"/>
           </w:tcPr>
           <w:p>
             <w:r>
@@ -123,7 +124,7 @@
         </w:tc>
         <w:tc>
           <w:tcPr>
-            <w:tcW w:type="dxa" w:w="1728"/>
+            <w:tcW w:type="dxa" w:w="1304"/>
           </w:tcPr>
           <w:p>
             <w:r>
@@ -133,7 +134,7 @@
         </w:tc>
         <w:tc>
           <w:tcPr>
-            <w:tcW w:type="dxa" w:w="1728"/>
+            <w:tcW w:type="dxa" w:w="2721"/>
           </w:tcPr>
           <w:p>
             <w:r>
@@ -143,7 +144,7 @@
         </w:tc>
         <w:tc>
           <w:tcPr>
-            <w:tcW w:type="dxa" w:w="1728"/>
+            <w:tcW w:type="dxa" w:w="1020"/>
           </w:tcPr>
           <w:p>
             <w:r>
@@ -153,11 +154,11 @@
         </w:tc>
         <w:tc>
           <w:tcPr>
-            <w:tcW w:type="dxa" w:w="1728"/>
+            <w:tcW w:type="dxa" w:w="3288"/>
           </w:tcPr>
           <w:p>
             <w:r>
-              <w:t>stop_latency_ms = 6 ms</w:t>
+              <w:t>stop latency ms = 6 ms</w:t>
             </w:r>
           </w:p>
         </w:tc>
@@ -165,7 +166,7 @@
       <w:tr>
         <w:tc>
           <w:tcPr>
-            <w:tcW w:type="dxa" w:w="1728"/>
+            <w:tcW w:type="dxa" w:w="737"/>
           </w:tcPr>
           <w:p>
             <w:r>
@@ -175,7 +176,7 @@
         </w:tc>
         <w:tc>
           <w:tcPr>
-            <w:tcW w:type="dxa" w:w="1728"/>
+            <w:tcW w:type="dxa" w:w="1304"/>
           </w:tcPr>
           <w:p>
             <w:r>
@@ -185,7 +186,7 @@
         </w:tc>
         <w:tc>
           <w:tcPr>
-            <w:tcW w:type="dxa" w:w="1728"/>
+            <w:tcW w:type="dxa" w:w="2721"/>
           </w:tcPr>
           <w:p>
             <w:r>
@@ -195,7 +196,7 @@
         </w:tc>
         <w:tc>
           <w:tcPr>
-            <w:tcW w:type="dxa" w:w="1728"/>
+            <w:tcW w:type="dxa" w:w="1020"/>
           </w:tcPr>
           <w:p>
             <w:r>
@@ -205,11 +206,11 @@
         </w:tc>
         <w:tc>
           <w:tcPr>
-            <w:tcW w:type="dxa" w:w="1728"/>
+            <w:tcW w:type="dxa" w:w="3288"/>
           </w:tcPr>
           <w:p>
             <w:r>
-              <w:t>stop_latency_ms = 7 ms</w:t>
+              <w:t>stop latency ms = 7 ms</w:t>
             </w:r>
           </w:p>
         </w:tc>
@@ -217,7 +218,7 @@
       <w:tr>
         <w:tc>
           <w:tcPr>
-            <w:tcW w:type="dxa" w:w="1728"/>
+            <w:tcW w:type="dxa" w:w="737"/>
           </w:tcPr>
           <w:p>
             <w:r>
@@ -227,7 +228,7 @@
         </w:tc>
         <w:tc>
           <w:tcPr>
-            <w:tcW w:type="dxa" w:w="1728"/>
+            <w:tcW w:type="dxa" w:w="1304"/>
           </w:tcPr>
           <w:p>
             <w:r>
@@ -237,7 +238,7 @@
         </w:tc>
         <w:tc>
           <w:tcPr>
-            <w:tcW w:type="dxa" w:w="1728"/>
+            <w:tcW w:type="dxa" w:w="2721"/>
           </w:tcPr>
           <w:p>
             <w:r>
@@ -247,7 +248,7 @@
         </w:tc>
         <w:tc>
           <w:tcPr>
-            <w:tcW w:type="dxa" w:w="1728"/>
+            <w:tcW w:type="dxa" w:w="1020"/>
           </w:tcPr>
           <w:p>
             <w:r>
@@ -257,11 +258,11 @@
         </w:tc>
         <w:tc>
           <w:tcPr>
-            <w:tcW w:type="dxa" w:w="1728"/>
+            <w:tcW w:type="dxa" w:w="3288"/>
           </w:tcPr>
           <w:p>
             <w:r>
-              <w:t>stop_latency_ms = 4 ms</w:t>
+              <w:t>stop latency ms = 4 ms</w:t>
             </w:r>
           </w:p>
         </w:tc>
@@ -269,7 +270,7 @@
       <w:tr>
         <w:tc>
           <w:tcPr>
-            <w:tcW w:type="dxa" w:w="1728"/>
+            <w:tcW w:type="dxa" w:w="737"/>
           </w:tcPr>
           <w:p>
             <w:r>
@@ -279,7 +280,7 @@
         </w:tc>
         <w:tc>
           <w:tcPr>
-            <w:tcW w:type="dxa" w:w="1728"/>
+            <w:tcW w:type="dxa" w:w="1304"/>
           </w:tcPr>
           <w:p>
             <w:r>
@@ -289,7 +290,7 @@
         </w:tc>
         <w:tc>
           <w:tcPr>
-            <w:tcW w:type="dxa" w:w="1728"/>
+            <w:tcW w:type="dxa" w:w="2721"/>
           </w:tcPr>
           <w:p>
             <w:r>
@@ -299,7 +300,7 @@
         </w:tc>
         <w:tc>
           <w:tcPr>
-            <w:tcW w:type="dxa" w:w="1728"/>
+            <w:tcW w:type="dxa" w:w="1020"/>
           </w:tcPr>
           <w:p>
             <w:r>
@@ -313,11 +314,11 @@
         </w:tc>
         <w:tc>
           <w:tcPr>
-            <w:tcW w:type="dxa" w:w="1728"/>
+            <w:tcW w:type="dxa" w:w="3288"/>
           </w:tcPr>
           <w:p>
             <w:r>
-              <w:t>stop_latency_ms = 14 ms</w:t>
+              <w:t>stop latency ms = 14 ms</w:t>
             </w:r>
           </w:p>
         </w:tc>
@@ -325,7 +326,7 @@
       <w:tr>
         <w:tc>
           <w:tcPr>
-            <w:tcW w:type="dxa" w:w="1728"/>
+            <w:tcW w:type="dxa" w:w="737"/>
           </w:tcPr>
           <w:p>
             <w:r>
@@ -335,7 +336,7 @@
         </w:tc>
         <w:tc>
           <w:tcPr>
-            <w:tcW w:type="dxa" w:w="1728"/>
+            <w:tcW w:type="dxa" w:w="1304"/>
           </w:tcPr>
           <w:p>
             <w:r>
@@ -345,7 +346,7 @@
         </w:tc>
         <w:tc>
           <w:tcPr>
-            <w:tcW w:type="dxa" w:w="1728"/>
+            <w:tcW w:type="dxa" w:w="2721"/>
           </w:tcPr>
           <w:p>
             <w:r>
@@ -355,7 +356,7 @@
         </w:tc>
         <w:tc>
           <w:tcPr>
-            <w:tcW w:type="dxa" w:w="1728"/>
+            <w:tcW w:type="dxa" w:w="1020"/>
           </w:tcPr>
           <w:p>
             <w:r>
@@ -365,11 +366,11 @@
         </w:tc>
         <w:tc>
           <w:tcPr>
-            <w:tcW w:type="dxa" w:w="1728"/>
+            <w:tcW w:type="dxa" w:w="3288"/>
           </w:tcPr>
           <w:p>
             <w:r>
-              <w:t>stop_latency_ms = 6 ms</w:t>
+              <w:t>stop latency ms = 6 ms</w:t>
             </w:r>
           </w:p>
         </w:tc>
@@ -377,7 +378,7 @@
       <w:tr>
         <w:tc>
           <w:tcPr>
-            <w:tcW w:type="dxa" w:w="1728"/>
+            <w:tcW w:type="dxa" w:w="737"/>
           </w:tcPr>
           <w:p>
             <w:r>
@@ -387,7 +388,7 @@
         </w:tc>
         <w:tc>
           <w:tcPr>
-            <w:tcW w:type="dxa" w:w="1728"/>
+            <w:tcW w:type="dxa" w:w="1304"/>
           </w:tcPr>
           <w:p>
             <w:r>
@@ -397,7 +398,7 @@
         </w:tc>
         <w:tc>
           <w:tcPr>
-            <w:tcW w:type="dxa" w:w="1728"/>
+            <w:tcW w:type="dxa" w:w="2721"/>
           </w:tcPr>
           <w:p>
             <w:r>
@@ -407,7 +408,7 @@
         </w:tc>
         <w:tc>
           <w:tcPr>
-            <w:tcW w:type="dxa" w:w="1728"/>
+            <w:tcW w:type="dxa" w:w="1020"/>
           </w:tcPr>
           <w:p>
             <w:r>
@@ -417,11 +418,11 @@
         </w:tc>
         <w:tc>
           <w:tcPr>
-            <w:tcW w:type="dxa" w:w="1728"/>
+            <w:tcW w:type="dxa" w:w="3288"/>
           </w:tcPr>
           <w:p>
             <w:r>
-              <w:t>stop_latency_ms = 5 ms</w:t>
+              <w:t>stop latency ms = 5 ms</w:t>
             </w:r>
           </w:p>
         </w:tc>
@@ -429,7 +430,7 @@
       <w:tr>
         <w:tc>
           <w:tcPr>
-            <w:tcW w:type="dxa" w:w="1728"/>
+            <w:tcW w:type="dxa" w:w="737"/>
           </w:tcPr>
           <w:p>
             <w:r>
@@ -439,7 +440,7 @@
         </w:tc>
         <w:tc>
           <w:tcPr>
-            <w:tcW w:type="dxa" w:w="1728"/>
+            <w:tcW w:type="dxa" w:w="1304"/>
           </w:tcPr>
           <w:p>
             <w:r>
@@ -449,7 +450,7 @@
         </w:tc>
         <w:tc>
           <w:tcPr>
-            <w:tcW w:type="dxa" w:w="1728"/>
+            <w:tcW w:type="dxa" w:w="2721"/>
           </w:tcPr>
           <w:p>
             <w:r>
@@ -459,7 +460,7 @@
         </w:tc>
         <w:tc>
           <w:tcPr>
-            <w:tcW w:type="dxa" w:w="1728"/>
+            <w:tcW w:type="dxa" w:w="1020"/>
           </w:tcPr>
           <w:p>
             <w:r>
@@ -469,11 +470,11 @@
         </w:tc>
         <w:tc>
           <w:tcPr>
-            <w:tcW w:type="dxa" w:w="1728"/>
+            <w:tcW w:type="dxa" w:w="3288"/>
           </w:tcPr>
           <w:p>
             <w:r>
-              <w:t>close_time_s = 3.816 s</w:t>
+              <w:t>close time s = 3.816 s</w:t>
             </w:r>
           </w:p>
         </w:tc>
@@ -481,7 +482,7 @@
       <w:tr>
         <w:tc>
           <w:tcPr>
-            <w:tcW w:type="dxa" w:w="1728"/>
+            <w:tcW w:type="dxa" w:w="737"/>
           </w:tcPr>
           <w:p>
             <w:r>
@@ -491,7 +492,7 @@
         </w:tc>
         <w:tc>
           <w:tcPr>
-            <w:tcW w:type="dxa" w:w="1728"/>
+            <w:tcW w:type="dxa" w:w="1304"/>
           </w:tcPr>
           <w:p>
             <w:r>
@@ -501,7 +502,7 @@
         </w:tc>
         <w:tc>
           <w:tcPr>
-            <w:tcW w:type="dxa" w:w="1728"/>
+            <w:tcW w:type="dxa" w:w="2721"/>
           </w:tcPr>
           <w:p>
             <w:r>
@@ -511,7 +512,7 @@
         </w:tc>
         <w:tc>
           <w:tcPr>
-            <w:tcW w:type="dxa" w:w="1728"/>
+            <w:tcW w:type="dxa" w:w="1020"/>
           </w:tcPr>
           <w:p>
             <w:r>
@@ -521,11 +522,11 @@
         </w:tc>
         <w:tc>
           <w:tcPr>
-            <w:tcW w:type="dxa" w:w="1728"/>
+            <w:tcW w:type="dxa" w:w="3288"/>
           </w:tcPr>
           <w:p>
             <w:r>
-              <w:t>stop_after_release_close_ms = 62 ms</w:t>
+              <w:t>stop after release close ms = 62 ms</w:t>
             </w:r>
           </w:p>
         </w:tc>
@@ -533,7 +534,7 @@
       <w:tr>
         <w:tc>
           <w:tcPr>
-            <w:tcW w:type="dxa" w:w="1728"/>
+            <w:tcW w:type="dxa" w:w="737"/>
           </w:tcPr>
           <w:p>
             <w:r>
@@ -543,7 +544,7 @@
         </w:tc>
         <w:tc>
           <w:tcPr>
-            <w:tcW w:type="dxa" w:w="1728"/>
+            <w:tcW w:type="dxa" w:w="1304"/>
           </w:tcPr>
           <w:p>
             <w:r>
@@ -553,7 +554,7 @@
         </w:tc>
         <w:tc>
           <w:tcPr>
-            <w:tcW w:type="dxa" w:w="1728"/>
+            <w:tcW w:type="dxa" w:w="2721"/>
           </w:tcPr>
           <w:p>
             <w:r>
@@ -563,7 +564,7 @@
         </w:tc>
         <w:tc>
           <w:tcPr>
-            <w:tcW w:type="dxa" w:w="1728"/>
+            <w:tcW w:type="dxa" w:w="1020"/>
           </w:tcPr>
           <w:p>
             <w:r>
@@ -577,11 +578,11 @@
         </w:tc>
         <w:tc>
           <w:tcPr>
-            <w:tcW w:type="dxa" w:w="1728"/>
+            <w:tcW w:type="dxa" w:w="3288"/>
           </w:tcPr>
           <w:p>
             <w:r>
-              <w:t>period_max_ms = 112 ms</w:t>
+              <w:t>period max ms = 112 ms</w:t>
             </w:r>
           </w:p>
         </w:tc>
@@ -589,7 +590,7 @@
       <w:tr>
         <w:tc>
           <w:tcPr>
-            <w:tcW w:type="dxa" w:w="1728"/>
+            <w:tcW w:type="dxa" w:w="737"/>
           </w:tcPr>
           <w:p>
             <w:r>
@@ -599,7 +600,7 @@
         </w:tc>
         <w:tc>
           <w:tcPr>
-            <w:tcW w:type="dxa" w:w="1728"/>
+            <w:tcW w:type="dxa" w:w="1304"/>
           </w:tcPr>
           <w:p>
             <w:r>
@@ -609,7 +610,7 @@
         </w:tc>
         <w:tc>
           <w:tcPr>
-            <w:tcW w:type="dxa" w:w="1728"/>
+            <w:tcW w:type="dxa" w:w="2721"/>
           </w:tcPr>
           <w:p>
             <w:r>
@@ -619,7 +620,7 @@
         </w:tc>
         <w:tc>
           <w:tcPr>
-            <w:tcW w:type="dxa" w:w="1728"/>
+            <w:tcW w:type="dxa" w:w="1020"/>
           </w:tcPr>
           <w:p>
             <w:r>
@@ -633,11 +634,11 @@
         </w:tc>
         <w:tc>
           <w:tcPr>
-            <w:tcW w:type="dxa" w:w="1728"/>
+            <w:tcW w:type="dxa" w:w="3288"/>
           </w:tcPr>
           <w:p>
             <w:r>
-              <w:t>max_current_above_130C_a = 15.16 A</w:t>
+              <w:t>max current above 130C a = 15.16 A</w:t>
             </w:r>
           </w:p>
         </w:tc>
@@ -645,7 +646,7 @@
       <w:tr>
         <w:tc>
           <w:tcPr>
-            <w:tcW w:type="dxa" w:w="1728"/>
+            <w:tcW w:type="dxa" w:w="737"/>
           </w:tcPr>
           <w:p>
             <w:r>
@@ -655,7 +656,7 @@
         </w:tc>
         <w:tc>
           <w:tcPr>
-            <w:tcW w:type="dxa" w:w="1728"/>
+            <w:tcW w:type="dxa" w:w="1304"/>
           </w:tcPr>
           <w:p>
             <w:r>
@@ -665,7 +666,7 @@
         </w:tc>
         <w:tc>
           <w:tcPr>
-            <w:tcW w:type="dxa" w:w="1728"/>
+            <w:tcW w:type="dxa" w:w="2721"/>
           </w:tcPr>
           <w:p>
             <w:r>
@@ -675,7 +676,7 @@
         </w:tc>
         <w:tc>
           <w:tcPr>
-            <w:tcW w:type="dxa" w:w="1728"/>
+            <w:tcW w:type="dxa" w:w="1020"/>
           </w:tcPr>
           <w:p>
             <w:r>
@@ -685,11 +686,11 @@
         </w:tc>
         <w:tc>
           <w:tcPr>
-            <w:tcW w:type="dxa" w:w="1728"/>
+            <w:tcW w:type="dxa" w:w="3288"/>
           </w:tcPr>
           <w:p>
             <w:r>
-              <w:t>stop_after_undervoltage_ms = 21 ms</w:t>
+              <w:t>stop after undervoltage ms = 21 ms</w:t>
             </w:r>
           </w:p>
         </w:tc>
@@ -697,7 +698,7 @@
       <w:tr>
         <w:tc>
           <w:tcPr>
-            <w:tcW w:type="dxa" w:w="1728"/>
+            <w:tcW w:type="dxa" w:w="737"/>
           </w:tcPr>
           <w:p>
             <w:r>
@@ -707,7 +708,7 @@
         </w:tc>
         <w:tc>
           <w:tcPr>
-            <w:tcW w:type="dxa" w:w="1728"/>
+            <w:tcW w:type="dxa" w:w="1304"/>
           </w:tcPr>
           <w:p>
             <w:r>
@@ -717,7 +718,7 @@
         </w:tc>
         <w:tc>
           <w:tcPr>
-            <w:tcW w:type="dxa" w:w="1728"/>
+            <w:tcW w:type="dxa" w:w="2721"/>
           </w:tcPr>
           <w:p>
             <w:r>
@@ -727,7 +728,7 @@
         </w:tc>
         <w:tc>
           <w:tcPr>
-            <w:tcW w:type="dxa" w:w="1728"/>
+            <w:tcW w:type="dxa" w:w="1020"/>
           </w:tcPr>
           <w:p>
             <w:r>
@@ -737,11 +738,11 @@
         </w:tc>
         <w:tc>
           <w:tcPr>
-            <w:tcW w:type="dxa" w:w="1728"/>
+            <w:tcW w:type="dxa" w:w="3288"/>
           </w:tcPr>
           <w:p>
             <w:r>
-              <w:t>dtc_code = B1A01</w:t>
+              <w:t>dtc code = B1A01</w:t>
             </w:r>
           </w:p>
         </w:tc>
@@ -768,7 +769,7 @@
               <a:graphicData uri="http://schemas.openxmlformats.org/drawingml/2006/picture">
                 <pic:pic>
                   <pic:nvPicPr>
-                    <pic:cNvPr id="0" name="trend.png"/>
+                    <pic:cNvPr id="0" name="trend-2026-10-06.png"/>
                     <pic:cNvPicPr/>
                   </pic:nvPicPr>
                   <pic:blipFill>

</xml_diff>